<commit_message>
updated expenses charges and page
</commit_message>
<xml_diff>
--- a/SRS.docx
+++ b/SRS.docx
@@ -323,7 +323,7 @@
       <w:r>
         <w:drawing>
           <wp:inline xmlns:a="http://schemas.openxmlformats.org/drawingml/2006/main" xmlns:pic="http://schemas.openxmlformats.org/drawingml/2006/picture">
-            <wp:extent cx="5669280" cy="3763640"/>
+            <wp:extent cx="5669280" cy="4037833"/>
             <wp:docPr id="3" name="Picture 3"/>
             <wp:cNvGraphicFramePr>
               <a:graphicFrameLocks noChangeAspect="1"/>
@@ -344,7 +344,7 @@
                   <pic:spPr>
                     <a:xfrm>
                       <a:off x="0" y="0"/>
-                      <a:ext cx="5669280" cy="3763640"/>
+                      <a:ext cx="5669280" cy="4037833"/>
                     </a:xfrm>
                     <a:prstGeom prst="rect"/>
                   </pic:spPr>

</xml_diff>

<commit_message>
to right notification badges
</commit_message>
<xml_diff>
--- a/SRS.docx
+++ b/SRS.docx
@@ -31,7 +31,7 @@
           <w:color w:val="0F766E"/>
           <w:sz w:val="28"/>
         </w:rPr>
-        <w:t>SoluoPrint - Advanced Print Shop Management System</w:t>
+        <w:t>SoluoPrint - Premium All-in-One Print Shop Management (Print/Job management, CRM, Financial Management &amp; Analytics Platform, Automated SMS Notifications)</w:t>
       </w:r>
     </w:p>
     <w:p>
@@ -77,7 +77,23 @@
           <w:color w:val="0F766E"/>
           <w:sz w:val="28"/>
         </w:rPr>
-        <w:t>1. Problem Statement &amp; Domain Context</w:t>
+        <w:t>1. Introduction</w:t>
+      </w:r>
+    </w:p>
+    <w:p>
+      <w:pPr>
+        <w:keepNext/>
+        <w:spacing w:before="280" w:after="160"/>
+      </w:pPr>
+      <w:r>
+        <w:rPr>
+          <w:rFonts w:ascii="Times New Roman" w:hAnsi="Times New Roman"/>
+          <w:b/>
+          <w:i/>
+          <w:color w:val="334155"/>
+          <w:sz w:val="24"/>
+        </w:rPr>
+        <w:t>1.1 Purpose</w:t>
       </w:r>
     </w:p>
     <w:p>
@@ -92,7 +108,23 @@
           <w:color w:val="000000"/>
           <w:sz w:val="24"/>
         </w:rPr>
-        <w:t>Empirical industry research reveals that 73% of fast-paced print shops and digital studios experience margin loss on up to 40% of custom orders when relying on generic tools like Microsoft Excel or QuickBooks. Generic accounting packages fail because custom print production involves complex area-based square footage calculations, custom material units (ft, in, cm, mm, m), multi-item bulk orders, fluctuating material pricing, and continuous customer 'job status' phone calls that degrade operational productivity.</w:t>
+        <w:t>This document specifies the software requirements for the SoluoPrint platform. SoluoPrint is a web-based, multi-tenant print shop ERP engineered to automate pricing calculations, production tracking, customer relations management (CRM), and financial accounting for specialized digital studios.</w:t>
+      </w:r>
+    </w:p>
+    <w:p>
+      <w:pPr>
+        <w:keepNext/>
+        <w:spacing w:before="280" w:after="160"/>
+      </w:pPr>
+      <w:r>
+        <w:rPr>
+          <w:rFonts w:ascii="Times New Roman" w:hAnsi="Times New Roman"/>
+          <w:b/>
+          <w:i/>
+          <w:color w:val="334155"/>
+          <w:sz w:val="24"/>
+        </w:rPr>
+        <w:t>1.2 Scope</w:t>
       </w:r>
     </w:p>
     <w:p>
@@ -107,7 +139,92 @@
           <w:color w:val="000000"/>
           <w:sz w:val="24"/>
         </w:rPr>
-        <w:t>SoluoPrint is designed specifically for Large Format Printing, T-Shirt and Apparel Printing, Embroidery, Packaging Design, and General Print Production. It directly solves domain challenges by providing a unified, multi-tenant print shop ERP platform featuring instant automated job pricing, smsonlineapi status notifications, Namecheap cPanel SMTP email verification, multi-account ledger tracking, digital payment gateways (Hubtel, Paystack, Flutterwave), and a self-service Customer Intake Portal.</w:t>
+        <w:t>The system scope covers single and bulk job creation, custom dimension calculators (supporting feet, inches, cm, mm, and meters), real-time production status tracking, a self-service customer intake portal, email and SMS notification engines (smsonlineapi / SMTP), and integrations with digital payment gateways (Hubtel, Paystack, Flutterwave).</w:t>
+      </w:r>
+    </w:p>
+    <w:p>
+      <w:pPr>
+        <w:keepNext/>
+        <w:spacing w:before="280" w:after="160"/>
+      </w:pPr>
+      <w:r>
+        <w:rPr>
+          <w:rFonts w:ascii="Times New Roman" w:hAnsi="Times New Roman"/>
+          <w:b/>
+          <w:i/>
+          <w:color w:val="334155"/>
+          <w:sz w:val="24"/>
+        </w:rPr>
+        <w:t>1.3 Definitions, Acronyms, and Abbreviations</w:t>
+      </w:r>
+    </w:p>
+    <w:p>
+      <w:pPr>
+        <w:spacing w:line="360" w:lineRule="auto" w:after="160"/>
+      </w:pPr>
+      <w:r>
+        <w:rPr>
+          <w:rFonts w:ascii="Times New Roman" w:hAnsi="Times New Roman"/>
+          <w:b w:val="0"/>
+          <w:i w:val="0"/>
+          <w:color w:val="000000"/>
+          <w:sz w:val="24"/>
+        </w:rPr>
+        <w:t>• ERP: Enterprise Resource Planning.</w:t>
+        <w:br/>
+        <w:t>• MoMo: Mobile Money.</w:t>
+        <w:br/>
+        <w:t>• RLS: Row Level Security.</w:t>
+        <w:br/>
+        <w:t>• SRS: Software Requirements Specification.</w:t>
+        <w:br/>
+        <w:t>• SMSGH: Telephony messaging protocol.</w:t>
+      </w:r>
+    </w:p>
+    <w:p>
+      <w:pPr>
+        <w:keepNext/>
+        <w:spacing w:before="280" w:after="160"/>
+      </w:pPr>
+      <w:r>
+        <w:rPr>
+          <w:rFonts w:ascii="Times New Roman" w:hAnsi="Times New Roman"/>
+          <w:b/>
+          <w:i/>
+          <w:color w:val="334155"/>
+          <w:sz w:val="24"/>
+        </w:rPr>
+        <w:t>1.4 References</w:t>
+      </w:r>
+    </w:p>
+    <w:p>
+      <w:pPr>
+        <w:spacing w:line="360" w:lineRule="auto" w:after="160"/>
+      </w:pPr>
+      <w:r>
+        <w:rPr>
+          <w:rFonts w:ascii="Times New Roman" w:hAnsi="Times New Roman"/>
+          <w:b w:val="0"/>
+          <w:i/>
+          <w:color w:val="000000"/>
+          <w:sz w:val="24"/>
+        </w:rPr>
+        <w:t>IEEE Computer Society. (1998). IEEE Std 830-1998: IEEE Recommended Practice for Software Requirements Specifications. IEEE.</w:t>
+      </w:r>
+    </w:p>
+    <w:p>
+      <w:pPr>
+        <w:spacing w:line="360" w:lineRule="auto" w:after="160"/>
+      </w:pPr>
+      <w:r>
+        <w:rPr>
+          <w:rFonts w:ascii="Times New Roman" w:hAnsi="Times New Roman"/>
+          <w:b w:val="0"/>
+          <w:i/>
+          <w:color w:val="000000"/>
+          <w:sz w:val="24"/>
+        </w:rPr>
+        <w:t>Supabase Documentation. (2026). Row Level Security &amp; Storage. Supabase Inc.</w:t>
       </w:r>
     </w:p>
     <w:p>
@@ -123,7 +240,23 @@
           <w:color w:val="0F766E"/>
           <w:sz w:val="28"/>
         </w:rPr>
-        <w:t>2. System Architecture &amp; Component Design</w:t>
+        <w:t>2. Overall Description</w:t>
+      </w:r>
+    </w:p>
+    <w:p>
+      <w:pPr>
+        <w:keepNext/>
+        <w:spacing w:before="280" w:after="160"/>
+      </w:pPr>
+      <w:r>
+        <w:rPr>
+          <w:rFonts w:ascii="Times New Roman" w:hAnsi="Times New Roman"/>
+          <w:b/>
+          <w:i/>
+          <w:color w:val="334155"/>
+          <w:sz w:val="24"/>
+        </w:rPr>
+        <w:t>2.1 Product Perspective</w:t>
       </w:r>
     </w:p>
     <w:p>
@@ -138,7 +271,222 @@
           <w:color w:val="000000"/>
           <w:sz w:val="24"/>
         </w:rPr>
-        <w:t>The system follows a modern 3-tier architecture separating Presentation UI (React 18 SPA), Application/Proxy Middleware (Namecheap cPanel PHP &amp; Edge Functions), and Persistence (Supabase PostgreSQL DB with Row Level Security).</w:t>
+        <w:t>SoluoPrint is a standalone multi-tenant web application that replaces spreadsheets and generic accounting systems. It integrates with external SMS services (smsonlineapi) and payment aggregators (Paystack) to deliver a unified workspace.</w:t>
+      </w:r>
+    </w:p>
+    <w:p>
+      <w:pPr>
+        <w:keepNext/>
+        <w:spacing w:before="280" w:after="160"/>
+      </w:pPr>
+      <w:r>
+        <w:rPr>
+          <w:rFonts w:ascii="Times New Roman" w:hAnsi="Times New Roman"/>
+          <w:b/>
+          <w:i/>
+          <w:color w:val="334155"/>
+          <w:sz w:val="24"/>
+        </w:rPr>
+        <w:t>2.2 Product Functions</w:t>
+      </w:r>
+    </w:p>
+    <w:p>
+      <w:pPr>
+        <w:spacing w:line="360" w:lineRule="auto" w:after="160"/>
+      </w:pPr>
+      <w:r>
+        <w:rPr>
+          <w:rFonts w:ascii="Times New Roman" w:hAnsi="Times New Roman"/>
+          <w:b w:val="0"/>
+          <w:i w:val="0"/>
+          <w:color w:val="000000"/>
+          <w:sz w:val="24"/>
+        </w:rPr>
+        <w:t>Key functions include automated pricing, job workflow tracking (Pending, In Progress, Completed, Delivered), customer balance management, ledger expense/revenue logging, and multi-format analytics reporting.</w:t>
+      </w:r>
+    </w:p>
+    <w:p>
+      <w:pPr>
+        <w:keepNext/>
+        <w:spacing w:before="280" w:after="160"/>
+      </w:pPr>
+      <w:r>
+        <w:rPr>
+          <w:rFonts w:ascii="Times New Roman" w:hAnsi="Times New Roman"/>
+          <w:b/>
+          <w:i/>
+          <w:color w:val="334155"/>
+          <w:sz w:val="24"/>
+        </w:rPr>
+        <w:t>2.3 User Characteristics</w:t>
+      </w:r>
+    </w:p>
+    <w:p>
+      <w:pPr>
+        <w:spacing w:line="360" w:lineRule="auto" w:after="160"/>
+      </w:pPr>
+      <w:r>
+        <w:rPr>
+          <w:rFonts w:ascii="Times New Roman" w:hAnsi="Times New Roman"/>
+          <w:b w:val="0"/>
+          <w:i w:val="0"/>
+          <w:color w:val="000000"/>
+          <w:sz w:val="24"/>
+        </w:rPr>
+        <w:t>• Shop Owner: Requires high-level financial health dashboards and settings control.</w:t>
+        <w:br/>
+        <w:t>• Press Operator: Requires simplified job lists and production tracking.</w:t>
+        <w:br/>
+        <w:t>• Customer: Requires self-service upload tools and payment checkout.</w:t>
+      </w:r>
+    </w:p>
+    <w:p>
+      <w:pPr>
+        <w:keepNext/>
+        <w:spacing w:before="280" w:after="160"/>
+      </w:pPr>
+      <w:r>
+        <w:rPr>
+          <w:rFonts w:ascii="Times New Roman" w:hAnsi="Times New Roman"/>
+          <w:b/>
+          <w:i/>
+          <w:color w:val="334155"/>
+          <w:sz w:val="24"/>
+        </w:rPr>
+        <w:t>2.4 Constraints</w:t>
+      </w:r>
+    </w:p>
+    <w:p>
+      <w:pPr>
+        <w:spacing w:line="360" w:lineRule="auto" w:after="160"/>
+      </w:pPr>
+      <w:r>
+        <w:rPr>
+          <w:rFonts w:ascii="Times New Roman" w:hAnsi="Times New Roman"/>
+          <w:b w:val="0"/>
+          <w:i w:val="0"/>
+          <w:color w:val="000000"/>
+          <w:sz w:val="24"/>
+        </w:rPr>
+        <w:t>The application requires internet connectivity to communicate with the Supabase database. Upload file sizes are constrained up to 500MB via Namecheap cPanel PHP configuration.</w:t>
+      </w:r>
+    </w:p>
+    <w:p>
+      <w:pPr>
+        <w:keepNext/>
+        <w:spacing w:before="280" w:after="160"/>
+      </w:pPr>
+      <w:r>
+        <w:rPr>
+          <w:rFonts w:ascii="Times New Roman" w:hAnsi="Times New Roman"/>
+          <w:b/>
+          <w:i w:val="0"/>
+          <w:color w:val="0F766E"/>
+          <w:sz w:val="28"/>
+        </w:rPr>
+        <w:t>3. Specific Requirements</w:t>
+      </w:r>
+    </w:p>
+    <w:p>
+      <w:pPr>
+        <w:keepNext/>
+        <w:spacing w:before="280" w:after="160"/>
+      </w:pPr>
+      <w:r>
+        <w:rPr>
+          <w:rFonts w:ascii="Times New Roman" w:hAnsi="Times New Roman"/>
+          <w:b/>
+          <w:i/>
+          <w:color w:val="334155"/>
+          <w:sz w:val="24"/>
+        </w:rPr>
+        <w:t>3.1 Functional Requirements</w:t>
+      </w:r>
+    </w:p>
+    <w:p>
+      <w:pPr>
+        <w:spacing w:line="360" w:lineRule="auto" w:after="160"/>
+      </w:pPr>
+      <w:r>
+        <w:rPr>
+          <w:rFonts w:ascii="Times New Roman" w:hAnsi="Times New Roman"/>
+          <w:b w:val="0"/>
+          <w:i w:val="0"/>
+          <w:color w:val="000000"/>
+          <w:sz w:val="24"/>
+        </w:rPr>
+        <w:t>FR-01: Dual-Provider Admin Authentication using Supabase Auth with RLS policies.</w:t>
+        <w:br/>
+        <w:t>FR-02: Customer Portal Dual Auth using custom customer credentials.</w:t>
+        <w:br/>
+        <w:t>FR-03: Single and Bulk Job Intake with automatic square footage calculation.</w:t>
+        <w:br/>
+        <w:t>FR-04: Preset Size Configuration to automate width/height fields in forms.</w:t>
+        <w:br/>
+        <w:t>FR-05: Real-time Production tracking across production phases.</w:t>
+        <w:br/>
+        <w:t>FR-06: Telephony Integration using smsonlineapi for transactional notifications.</w:t>
+        <w:br/>
+        <w:t>FR-07: Payment Clearing &amp; Ledger recording against outstanding balances.</w:t>
+        <w:br/>
+        <w:t>FR-08: In-App notification system triggered on job creations or portal uploads.</w:t>
+        <w:br/>
+        <w:t>FR-09: Financial report compilation (PDF/Excel/PNG export) for P&amp;L, Revenue, and Expenses.</w:t>
+        <w:br/>
+        <w:t>FR-10: Activity Logging &amp; Audit Trail to monitor user logins and operations.</w:t>
+      </w:r>
+    </w:p>
+    <w:p>
+      <w:pPr>
+        <w:keepNext/>
+        <w:spacing w:before="280" w:after="160"/>
+      </w:pPr>
+      <w:r>
+        <w:rPr>
+          <w:rFonts w:ascii="Times New Roman" w:hAnsi="Times New Roman"/>
+          <w:b/>
+          <w:i/>
+          <w:color w:val="334155"/>
+          <w:sz w:val="24"/>
+        </w:rPr>
+        <w:t>3.2 Non-Functional Requirements</w:t>
+      </w:r>
+    </w:p>
+    <w:p>
+      <w:pPr>
+        <w:spacing w:line="360" w:lineRule="auto" w:after="160"/>
+      </w:pPr>
+      <w:r>
+        <w:rPr>
+          <w:rFonts w:ascii="Times New Roman" w:hAnsi="Times New Roman"/>
+          <w:b w:val="0"/>
+          <w:i w:val="0"/>
+          <w:color w:val="000000"/>
+          <w:sz w:val="24"/>
+        </w:rPr>
+        <w:t>• NFR-01: Performance &amp; Latency: Dashboard metrics and financial aggregations must load within 1.5 seconds under a load of 100 concurrent requests.</w:t>
+        <w:br/>
+        <w:t>• NFR-02: Security: All persistent tables must enforce Supabase Row Level Security (RLS) policies. Sensitive database credentials and API keys must be isolated in cPanel environment variables.</w:t>
+        <w:br/>
+        <w:t>• NFR-03: Reliability &amp; Fault Tolerance: The frontend application must include a ConnectivityManager to handle network drops and reconnect to database subscriptions seamlessly.</w:t>
+        <w:br/>
+        <w:t>• NFR-04: Portability: The system must render consistently across standard modern web browsers (Chrome, Safari, Firefox, Edge) using a responsive CSS layout.</w:t>
+      </w:r>
+    </w:p>
+    <w:p>
+      <w:pPr>
+        <w:keepNext/>
+        <w:spacing w:before="280" w:after="160"/>
+      </w:pPr>
+      <w:r>
+        <w:rPr>
+          <w:rFonts w:ascii="Times New Roman" w:hAnsi="Times New Roman"/>
+          <w:b/>
+          <w:i w:val="0"/>
+          <w:color w:val="0F766E"/>
+          <w:sz w:val="28"/>
+        </w:rPr>
+        <w:t>4. System Architecture &amp; Diagrams</w:t>
       </w:r>
     </w:p>
     <w:p>
@@ -199,37 +547,6 @@
     </w:p>
     <w:p>
       <w:pPr>
-        <w:keepNext/>
-        <w:spacing w:before="280" w:after="160"/>
-      </w:pPr>
-      <w:r>
-        <w:rPr>
-          <w:rFonts w:ascii="Times New Roman" w:hAnsi="Times New Roman"/>
-          <w:b/>
-          <w:i w:val="0"/>
-          <w:color w:val="0F766E"/>
-          <w:sz w:val="28"/>
-        </w:rPr>
-        <w:t>3. Entity-Relationship &amp; Database Schema</w:t>
-      </w:r>
-    </w:p>
-    <w:p>
-      <w:pPr>
-        <w:spacing w:line="360" w:lineRule="auto" w:after="160"/>
-      </w:pPr>
-      <w:r>
-        <w:rPr>
-          <w:rFonts w:ascii="Times New Roman" w:hAnsi="Times New Roman"/>
-          <w:b w:val="0"/>
-          <w:i w:val="0"/>
-          <w:color w:val="000000"/>
-          <w:sz w:val="24"/>
-        </w:rPr>
-        <w:t>The database schema is fully normalized in PostgreSQL, enforcing foreign key integrity across multi-tenant companies, customer profiles, print jobs, payments, ledger accounts, and custom size presets.</w:t>
-      </w:r>
-    </w:p>
-    <w:p>
-      <w:pPr>
         <w:spacing w:after="80"/>
         <w:jc w:val="center"/>
       </w:pPr>
@@ -282,37 +599,6 @@
           <w:sz w:val="19"/>
         </w:rPr>
         <w:t>Figure Evidence: Normalized Entity-Relationship Diagram (ERD)</w:t>
-      </w:r>
-    </w:p>
-    <w:p>
-      <w:pPr>
-        <w:keepNext/>
-        <w:spacing w:before="280" w:after="160"/>
-      </w:pPr>
-      <w:r>
-        <w:rPr>
-          <w:rFonts w:ascii="Times New Roman" w:hAnsi="Times New Roman"/>
-          <w:b/>
-          <w:i w:val="0"/>
-          <w:color w:val="0F766E"/>
-          <w:sz w:val="28"/>
-        </w:rPr>
-        <w:t>4. Use Case Analysis</w:t>
-      </w:r>
-    </w:p>
-    <w:p>
-      <w:pPr>
-        <w:spacing w:line="360" w:lineRule="auto" w:after="160"/>
-      </w:pPr>
-      <w:r>
-        <w:rPr>
-          <w:rFonts w:ascii="Times New Roman" w:hAnsi="Times New Roman"/>
-          <w:b w:val="0"/>
-          <w:i w:val="0"/>
-          <w:color w:val="000000"/>
-          <w:sz w:val="24"/>
-        </w:rPr>
-        <w:t>The system supports three primary actors: Shop Admin, Press Staff, and External Customers.</w:t>
       </w:r>
     </w:p>
     <w:p>

</xml_diff>